<commit_message>
Agrego casos de prueba y plan de pruebas
</commit_message>
<xml_diff>
--- a/Formatos/Plan de Pruebas.docx
+++ b/Formatos/Plan de Pruebas.docx
@@ -852,33 +852,9 @@
       </w:pPr>
       <w:r>
         <w:rPr>
-          <w:rFonts w:asciiTheme="minorHAnsi" w:hAnsiTheme="minorHAnsi" w:cstheme="minorHAnsi"/>
+          <w:rFonts w:ascii="Calibri" w:hAnsi="Calibri" w:cs="Calibri" w:asciiTheme="minorAscii" w:hAnsiTheme="minorAscii" w:cstheme="minorAscii"/>
         </w:rPr>
         <w:t>Verificar la consistencia de los cálculos numéricos y astronómicos (sol, luna y fechas), evaluando el comportamiento del software ante datos límite e inválidos.</w:t>
-      </w:r>
-    </w:p>
-    <w:p>
-      <w:pPr>
-        <w:pStyle w:val="ListParagraph"/>
-        <w:numPr>
-          <w:ilvl w:val="0"/>
-          <w:numId w:val="1"/>
-        </w:numPr>
-        <w:rPr>
-          <w:rFonts w:asciiTheme="minorHAnsi" w:hAnsiTheme="minorHAnsi" w:cstheme="minorHAnsi"/>
-        </w:rPr>
-      </w:pPr>
-      <w:r>
-        <w:rPr>
-          <w:rFonts w:asciiTheme="minorHAnsi" w:hAnsiTheme="minorHAnsi" w:cstheme="minorHAnsi"/>
-        </w:rPr>
-        <w:t>Documentar errores técnicos en Jira, clasificándolos por severidad para facilitar su resolución oportuna por el equipo de desarrollo</w:t>
-      </w:r>
-      <w:r>
-        <w:rPr>
-          <w:rFonts w:asciiTheme="minorHAnsi" w:hAnsiTheme="minorHAnsi" w:cstheme="minorHAnsi"/>
-        </w:rPr>
-        <w:t>.</w:t>
       </w:r>
     </w:p>
     <w:p>
@@ -2010,7 +1986,7 @@
         <w:spacing w:line="259" w:lineRule="auto"/>
         <w:jc w:val="both"/>
         <w:rPr>
-          <w:rFonts w:asciiTheme="minorHAnsi" w:hAnsiTheme="minorHAnsi" w:eastAsiaTheme="minorEastAsia" w:cstheme="minorBidi"/>
+          <w:rFonts w:ascii="Calibri" w:hAnsi="Calibri" w:eastAsia="游明朝" w:cs="Arial" w:asciiTheme="minorAscii" w:hAnsiTheme="minorAscii" w:eastAsiaTheme="minorEastAsia" w:cstheme="minorBidi"/>
           <w:sz w:val="22"/>
           <w:szCs w:val="22"/>
         </w:rPr>
@@ -2018,7 +1994,7 @@
       <w:commentRangeStart w:id="4"/>
       <w:r>
         <w:rPr>
-          <w:rFonts w:asciiTheme="minorHAnsi" w:hAnsiTheme="minorHAnsi" w:eastAsiaTheme="minorEastAsia" w:cstheme="minorBidi"/>
+          <w:rFonts w:ascii="Calibri" w:hAnsi="Calibri" w:eastAsia="游明朝" w:cs="Arial" w:asciiTheme="minorAscii" w:hAnsiTheme="minorAscii" w:eastAsiaTheme="minorEastAsia" w:cstheme="minorBidi"/>
           <w:sz w:val="22"/>
           <w:szCs w:val="22"/>
         </w:rPr>
@@ -2026,15 +2002,31 @@
       </w:r>
       <w:r>
         <w:rPr>
-          <w:rFonts w:asciiTheme="minorHAnsi" w:hAnsiTheme="minorHAnsi" w:eastAsiaTheme="minorEastAsia" w:cstheme="minorBidi"/>
-          <w:sz w:val="22"/>
-          <w:szCs w:val="22"/>
-        </w:rPr>
-        <w:t>, sino que se documentarán en Word.</w:t>
+          <w:rFonts w:ascii="Calibri" w:hAnsi="Calibri" w:eastAsia="游明朝" w:cs="Arial" w:asciiTheme="minorAscii" w:hAnsiTheme="minorAscii" w:eastAsiaTheme="minorEastAsia" w:cstheme="minorBidi"/>
+          <w:sz w:val="22"/>
+          <w:szCs w:val="22"/>
+        </w:rPr>
+        <w:t xml:space="preserve">, sino que se documentarán en </w:t>
       </w:r>
       <w:r>
         <w:rPr>
-          <w:rFonts w:asciiTheme="minorHAnsi" w:hAnsiTheme="minorHAnsi" w:eastAsiaTheme="minorEastAsia" w:cstheme="minorBidi"/>
+          <w:rFonts w:ascii="Calibri" w:hAnsi="Calibri" w:eastAsia="游明朝" w:cs="Arial" w:asciiTheme="minorAscii" w:hAnsiTheme="minorAscii" w:eastAsiaTheme="minorEastAsia" w:cstheme="minorBidi"/>
+          <w:sz w:val="22"/>
+          <w:szCs w:val="22"/>
+        </w:rPr>
+        <w:t>HTML</w:t>
+      </w:r>
+      <w:r>
+        <w:rPr>
+          <w:rFonts w:ascii="Calibri" w:hAnsi="Calibri" w:eastAsia="游明朝" w:cs="Arial" w:asciiTheme="minorAscii" w:hAnsiTheme="minorAscii" w:eastAsiaTheme="minorEastAsia" w:cstheme="minorBidi"/>
+          <w:sz w:val="22"/>
+          <w:szCs w:val="22"/>
+        </w:rPr>
+        <w:t>.</w:t>
+      </w:r>
+      <w:r>
+        <w:rPr>
+          <w:rFonts w:ascii="Calibri" w:hAnsi="Calibri" w:eastAsia="游明朝" w:cs="Arial" w:asciiTheme="minorAscii" w:hAnsiTheme="minorAscii" w:eastAsiaTheme="minorEastAsia" w:cstheme="minorBidi"/>
           <w:sz w:val="22"/>
           <w:szCs w:val="22"/>
         </w:rPr>
@@ -2042,7 +2034,7 @@
       </w:r>
       <w:r>
         <w:rPr>
-          <w:rFonts w:asciiTheme="minorHAnsi" w:hAnsiTheme="minorHAnsi" w:eastAsiaTheme="minorEastAsia" w:cstheme="minorBidi"/>
+          <w:rFonts w:ascii="Calibri" w:hAnsi="Calibri" w:eastAsia="游明朝" w:cs="Arial" w:asciiTheme="minorAscii" w:hAnsiTheme="minorAscii" w:eastAsiaTheme="minorEastAsia" w:cstheme="minorBidi"/>
           <w:sz w:val="22"/>
           <w:szCs w:val="22"/>
         </w:rPr>
@@ -2050,7 +2042,7 @@
       </w:r>
       <w:r>
         <w:rPr>
-          <w:rFonts w:asciiTheme="minorHAnsi" w:hAnsiTheme="minorHAnsi" w:eastAsiaTheme="minorEastAsia" w:cstheme="minorBidi"/>
+          <w:rFonts w:ascii="Calibri" w:hAnsi="Calibri" w:eastAsia="游明朝" w:cs="Arial" w:asciiTheme="minorAscii" w:hAnsiTheme="minorAscii" w:eastAsiaTheme="minorEastAsia" w:cstheme="minorBidi"/>
           <w:sz w:val="22"/>
           <w:szCs w:val="22"/>
         </w:rPr>
@@ -2060,11 +2052,64 @@
       <w:r>
         <w:rPr>
           <w:rStyle w:val="CommentReference"/>
-          <w:rFonts w:asciiTheme="minorHAnsi" w:hAnsiTheme="minorHAnsi" w:eastAsiaTheme="minorEastAsia" w:cstheme="minorBidi"/>
-          <w:sz w:val="22"/>
-          <w:szCs w:val="22"/>
         </w:rPr>
         <w:commentReference w:id="4"/>
+      </w:r>
+    </w:p>
+    <w:p>
+      <w:pPr>
+        <w:pStyle w:val="ListParagraph"/>
+        <w:numPr>
+          <w:ilvl w:val="0"/>
+          <w:numId w:val="18"/>
+        </w:numPr>
+        <w:spacing w:line="259" w:lineRule="auto"/>
+        <w:jc w:val="both"/>
+        <w:rPr>
+          <w:rFonts w:ascii="Calibri" w:hAnsi="Calibri" w:eastAsia="游明朝" w:cs="Arial" w:asciiTheme="minorAscii" w:hAnsiTheme="minorAscii" w:eastAsiaTheme="minorEastAsia" w:cstheme="minorBidi"/>
+          <w:sz w:val="22"/>
+          <w:szCs w:val="22"/>
+        </w:rPr>
+      </w:pPr>
+      <w:r>
+        <w:rPr>
+          <w:rFonts w:ascii="Calibri" w:hAnsi="Calibri" w:eastAsia="游明朝" w:cs="Arial" w:asciiTheme="minorAscii" w:hAnsiTheme="minorAscii" w:eastAsiaTheme="minorEastAsia" w:cstheme="minorBidi"/>
+          <w:sz w:val="22"/>
+          <w:szCs w:val="22"/>
+        </w:rPr>
+        <w:t xml:space="preserve">Los resultados de </w:t>
+      </w:r>
+      <w:r>
+        <w:rPr>
+          <w:rFonts w:ascii="Calibri" w:hAnsi="Calibri" w:eastAsia="游明朝" w:cs="Arial" w:asciiTheme="minorAscii" w:hAnsiTheme="minorAscii" w:eastAsiaTheme="minorEastAsia" w:cstheme="minorBidi"/>
+          <w:sz w:val="22"/>
+          <w:szCs w:val="22"/>
+        </w:rPr>
+        <w:t>lighthouse</w:t>
+      </w:r>
+      <w:r>
+        <w:rPr>
+          <w:rFonts w:ascii="Calibri" w:hAnsi="Calibri" w:eastAsia="游明朝" w:cs="Arial" w:asciiTheme="minorAscii" w:hAnsiTheme="minorAscii" w:eastAsiaTheme="minorEastAsia" w:cstheme="minorBidi"/>
+          <w:sz w:val="22"/>
+          <w:szCs w:val="22"/>
+        </w:rPr>
+        <w:t xml:space="preserve"> se </w:t>
+      </w:r>
+      <w:r>
+        <w:rPr>
+          <w:rFonts w:ascii="Calibri" w:hAnsi="Calibri" w:eastAsia="游明朝" w:cs="Arial" w:asciiTheme="minorAscii" w:hAnsiTheme="minorAscii" w:eastAsiaTheme="minorEastAsia" w:cstheme="minorBidi"/>
+          <w:sz w:val="22"/>
+          <w:szCs w:val="22"/>
+        </w:rPr>
+        <w:t>documentarán</w:t>
+      </w:r>
+      <w:r>
+        <w:rPr>
+          <w:rFonts w:ascii="Calibri" w:hAnsi="Calibri" w:eastAsia="游明朝" w:cs="Arial" w:asciiTheme="minorAscii" w:hAnsiTheme="minorAscii" w:eastAsiaTheme="minorEastAsia" w:cstheme="minorBidi"/>
+          <w:sz w:val="22"/>
+          <w:szCs w:val="22"/>
+        </w:rPr>
+        <w:t xml:space="preserve"> en PDF.[1]</w:t>
       </w:r>
     </w:p>
     <w:p>
@@ -3762,7 +3807,7 @@
           <w:numId w:val="17"/>
         </w:numPr>
         <w:rPr>
-          <w:rFonts w:asciiTheme="minorHAnsi" w:hAnsiTheme="minorHAnsi" w:eastAsiaTheme="minorEastAsia" w:cstheme="minorBidi"/>
+          <w:rFonts w:ascii="Calibri" w:hAnsi="Calibri" w:eastAsia="游明朝" w:cs="Arial" w:asciiTheme="minorAscii" w:hAnsiTheme="minorAscii" w:eastAsiaTheme="minorEastAsia" w:cstheme="minorBidi"/>
           <w:color w:val="000000" w:themeColor="text1"/>
           <w:sz w:val="22"/>
           <w:szCs w:val="22"/>
@@ -3771,10 +3816,10 @@
       </w:pPr>
       <w:r>
         <w:rPr>
-          <w:rFonts w:asciiTheme="minorHAnsi" w:hAnsiTheme="minorHAnsi" w:eastAsiaTheme="minorEastAsia" w:cstheme="minorBidi"/>
-          <w:b/>
-          <w:bCs/>
-          <w:color w:val="000000" w:themeColor="text1"/>
+          <w:rFonts w:ascii="Calibri" w:hAnsi="Calibri" w:eastAsia="游明朝" w:cs="Arial" w:asciiTheme="minorAscii" w:hAnsiTheme="minorAscii" w:eastAsiaTheme="minorEastAsia" w:cstheme="minorBidi"/>
+          <w:b w:val="1"/>
+          <w:bCs w:val="1"/>
+          <w:color w:val="000000" w:themeColor="text1" w:themeTint="FF" w:themeShade="FF"/>
           <w:sz w:val="22"/>
           <w:szCs w:val="22"/>
           <w:lang w:val="es-CO"/>
@@ -3783,13 +3828,39 @@
       </w:r>
       <w:r>
         <w:rPr>
-          <w:rFonts w:asciiTheme="minorHAnsi" w:hAnsiTheme="minorHAnsi" w:eastAsiaTheme="minorEastAsia" w:cstheme="minorBidi"/>
-          <w:color w:val="000000" w:themeColor="text1"/>
+          <w:rFonts w:ascii="Calibri" w:hAnsi="Calibri" w:eastAsia="游明朝" w:cs="Arial" w:asciiTheme="minorAscii" w:hAnsiTheme="minorAscii" w:eastAsiaTheme="minorEastAsia" w:cstheme="minorBidi"/>
+          <w:color w:val="000000" w:themeColor="text1" w:themeTint="FF" w:themeShade="FF"/>
           <w:sz w:val="22"/>
           <w:szCs w:val="22"/>
           <w:lang w:val="es-CO"/>
         </w:rPr>
         <w:t xml:space="preserve"> Lighthouse</w:t>
+      </w:r>
+    </w:p>
+    <w:p>
+      <w:pPr>
+        <w:pStyle w:val="ListParagraph"/>
+        <w:numPr>
+          <w:ilvl w:val="0"/>
+          <w:numId w:val="17"/>
+        </w:numPr>
+        <w:rPr>
+          <w:rFonts w:ascii="Calibri" w:hAnsi="Calibri" w:eastAsia="游明朝" w:cs="Arial" w:asciiTheme="minorAscii" w:hAnsiTheme="minorAscii" w:eastAsiaTheme="minorEastAsia" w:cstheme="minorBidi"/>
+          <w:color w:val="000000" w:themeColor="text1" w:themeTint="FF" w:themeShade="FF"/>
+          <w:sz w:val="22"/>
+          <w:szCs w:val="22"/>
+          <w:lang w:val="es-CO"/>
+        </w:rPr>
+      </w:pPr>
+      <w:r>
+        <w:rPr>
+          <w:rFonts w:ascii="Calibri" w:hAnsi="Calibri" w:eastAsia="游明朝" w:cs="Arial" w:asciiTheme="minorAscii" w:hAnsiTheme="minorAscii" w:eastAsiaTheme="minorEastAsia" w:cstheme="minorBidi"/>
+          <w:color w:val="000000" w:themeColor="text1" w:themeTint="FF" w:themeShade="FF"/>
+          <w:sz w:val="22"/>
+          <w:szCs w:val="22"/>
+          <w:lang w:val="es-CO"/>
+        </w:rPr>
+        <w:t>Pruebas de carga con JMeter</w:t>
       </w:r>
     </w:p>
     <w:p>

</xml_diff>